<commit_message>
Revamp homepage UI, styles, and add mocks
Overhaul the marketing site: adjust color palette and typography (switch to Newsreader), simplify LevelSection layout, and refresh header/footer and overall page layout. Add two new UI mock components (BriefingMock, ReportsMock) and update window chrome, demo video, product shot, notify form, and unreported grid styles. Replace screenshot assets with live variants and update the business plan doc. Refactor BrandLogo API (light prop) and small content copy edits across the homepage.
</commit_message>
<xml_diff>
--- a/website/public/Statera_Business_Plan.docx
+++ b/website/public/Statera_Business_Plan.docx
@@ -250,17 +250,7 @@
           <w:sz w:val="16"/>
           <w:szCs w:val="16"/>
         </w:rPr>
-        <w:t>. It is shared for evaluation purposes only and ma</w:t>
-      </w:r>
-      <w:r>
-        <w:rPr>
-          <w:i/>
-          <w:iCs/>
-          <w:color w:val="5A6472"/>
-          <w:sz w:val="16"/>
-          <w:szCs w:val="16"/>
-        </w:rPr>
-        <w:t>y not be reproduced or distributed without written permission.</w:t>
+        <w:t>. It is shared for evaluation purposes only and may not be reproduced or distributed without written permission.</w:t>
       </w:r>
     </w:p>
     <w:p>
@@ -280,6 +270,7 @@
           <w:sz w:val="32"/>
           <w:szCs w:val="32"/>
         </w:rPr>
+        <w:lastRenderedPageBreak/>
         <w:t>Table of Contents</w:t>
       </w:r>
     </w:p>
@@ -288,7 +279,6 @@
         <w:alias w:val="Table of Contents"/>
         <w:id w:val="-217979879"/>
       </w:sdtPr>
-      <w:sdtEndPr/>
       <w:sdtContent>
         <w:p>
           <w:pPr>
@@ -350,7 +340,7 @@
               <w:rPr>
                 <w:noProof/>
               </w:rPr>
-              <w:t>1</w:t>
+              <w:t>4</w:t>
             </w:r>
             <w:r>
               <w:rPr>
@@ -411,7 +401,7 @@
               <w:rPr>
                 <w:noProof/>
               </w:rPr>
-              <w:t>1</w:t>
+              <w:t>4</w:t>
             </w:r>
             <w:r>
               <w:rPr>
@@ -472,7 +462,7 @@
               <w:rPr>
                 <w:noProof/>
               </w:rPr>
-              <w:t>1</w:t>
+              <w:t>4</w:t>
             </w:r>
             <w:r>
               <w:rPr>
@@ -533,7 +523,7 @@
               <w:rPr>
                 <w:noProof/>
               </w:rPr>
-              <w:t>1</w:t>
+              <w:t>4</w:t>
             </w:r>
             <w:r>
               <w:rPr>
@@ -594,7 +584,7 @@
               <w:rPr>
                 <w:noProof/>
               </w:rPr>
-              <w:t>1</w:t>
+              <w:t>4</w:t>
             </w:r>
             <w:r>
               <w:rPr>
@@ -655,7 +645,7 @@
               <w:rPr>
                 <w:noProof/>
               </w:rPr>
-              <w:t>1</w:t>
+              <w:t>4</w:t>
             </w:r>
             <w:r>
               <w:rPr>
@@ -716,7 +706,7 @@
               <w:rPr>
                 <w:noProof/>
               </w:rPr>
-              <w:t>1</w:t>
+              <w:t>5</w:t>
             </w:r>
             <w:r>
               <w:rPr>
@@ -777,7 +767,7 @@
               <w:rPr>
                 <w:noProof/>
               </w:rPr>
-              <w:t>1</w:t>
+              <w:t>5</w:t>
             </w:r>
             <w:r>
               <w:rPr>
@@ -838,7 +828,7 @@
               <w:rPr>
                 <w:noProof/>
               </w:rPr>
-              <w:t>1</w:t>
+              <w:t>6</w:t>
             </w:r>
             <w:r>
               <w:rPr>
@@ -899,7 +889,7 @@
               <w:rPr>
                 <w:noProof/>
               </w:rPr>
-              <w:t>1</w:t>
+              <w:t>6</w:t>
             </w:r>
             <w:r>
               <w:rPr>
@@ -960,7 +950,7 @@
               <w:rPr>
                 <w:noProof/>
               </w:rPr>
-              <w:t>1</w:t>
+              <w:t>6</w:t>
             </w:r>
             <w:r>
               <w:rPr>
@@ -1021,7 +1011,7 @@
               <w:rPr>
                 <w:noProof/>
               </w:rPr>
-              <w:t>1</w:t>
+              <w:t>7</w:t>
             </w:r>
             <w:r>
               <w:rPr>
@@ -1082,7 +1072,7 @@
               <w:rPr>
                 <w:noProof/>
               </w:rPr>
-              <w:t>1</w:t>
+              <w:t>7</w:t>
             </w:r>
             <w:r>
               <w:rPr>
@@ -1143,7 +1133,7 @@
               <w:rPr>
                 <w:noProof/>
               </w:rPr>
-              <w:t>1</w:t>
+              <w:t>7</w:t>
             </w:r>
             <w:r>
               <w:rPr>
@@ -1204,7 +1194,7 @@
               <w:rPr>
                 <w:noProof/>
               </w:rPr>
-              <w:t>1</w:t>
+              <w:t>7</w:t>
             </w:r>
             <w:r>
               <w:rPr>
@@ -1265,7 +1255,7 @@
               <w:rPr>
                 <w:noProof/>
               </w:rPr>
-              <w:t>1</w:t>
+              <w:t>8</w:t>
             </w:r>
             <w:r>
               <w:rPr>
@@ -1315,18 +1305,16 @@
               <w:rPr>
                 <w:noProof/>
               </w:rPr>
-            </w:r>
-            <w:r>
-              <w:rPr>
-                <w:noProof/>
-              </w:rPr>
               <w:fldChar w:fldCharType="separate"/>
             </w:r>
             <w:r>
               <w:rPr>
-                <w:noProof/>
-              </w:rPr>
-              <w:t>1</w:t>
+                <w:b/>
+                <w:bCs/>
+                <w:noProof/>
+                <w:lang w:val="en-US"/>
+              </w:rPr>
+              <w:t>Error! Bookmark not defined.</w:t>
             </w:r>
             <w:r>
               <w:rPr>
@@ -1376,18 +1364,16 @@
               <w:rPr>
                 <w:noProof/>
               </w:rPr>
-            </w:r>
-            <w:r>
-              <w:rPr>
-                <w:noProof/>
-              </w:rPr>
               <w:fldChar w:fldCharType="separate"/>
             </w:r>
             <w:r>
               <w:rPr>
-                <w:noProof/>
-              </w:rPr>
-              <w:t>1</w:t>
+                <w:b/>
+                <w:bCs/>
+                <w:noProof/>
+                <w:lang w:val="en-US"/>
+              </w:rPr>
+              <w:t>Error! Bookmark not defined.</w:t>
             </w:r>
             <w:r>
               <w:rPr>
@@ -1448,7 +1434,7 @@
               <w:rPr>
                 <w:noProof/>
               </w:rPr>
-              <w:t>1</w:t>
+              <w:t>9</w:t>
             </w:r>
             <w:r>
               <w:rPr>
@@ -1498,18 +1484,16 @@
               <w:rPr>
                 <w:noProof/>
               </w:rPr>
-            </w:r>
-            <w:r>
-              <w:rPr>
-                <w:noProof/>
-              </w:rPr>
               <w:fldChar w:fldCharType="separate"/>
             </w:r>
             <w:r>
               <w:rPr>
-                <w:noProof/>
-              </w:rPr>
-              <w:t>1</w:t>
+                <w:b/>
+                <w:bCs/>
+                <w:noProof/>
+                <w:lang w:val="en-US"/>
+              </w:rPr>
+              <w:t>Error! Bookmark not defined.</w:t>
             </w:r>
             <w:r>
               <w:rPr>
@@ -1559,18 +1543,16 @@
               <w:rPr>
                 <w:noProof/>
               </w:rPr>
-            </w:r>
-            <w:r>
-              <w:rPr>
-                <w:noProof/>
-              </w:rPr>
               <w:fldChar w:fldCharType="separate"/>
             </w:r>
             <w:r>
               <w:rPr>
-                <w:noProof/>
-              </w:rPr>
-              <w:t>1</w:t>
+                <w:b/>
+                <w:bCs/>
+                <w:noProof/>
+                <w:lang w:val="en-US"/>
+              </w:rPr>
+              <w:t>Error! Bookmark not defined.</w:t>
             </w:r>
             <w:r>
               <w:rPr>
@@ -1631,7 +1613,7 @@
               <w:rPr>
                 <w:noProof/>
               </w:rPr>
-              <w:t>1</w:t>
+              <w:t>9</w:t>
             </w:r>
             <w:r>
               <w:rPr>
@@ -1692,7 +1674,7 @@
               <w:rPr>
                 <w:noProof/>
               </w:rPr>
-              <w:t>1</w:t>
+              <w:t>9</w:t>
             </w:r>
             <w:r>
               <w:rPr>
@@ -1753,7 +1735,7 @@
               <w:rPr>
                 <w:noProof/>
               </w:rPr>
-              <w:t>1</w:t>
+              <w:t>10</w:t>
             </w:r>
             <w:r>
               <w:rPr>
@@ -1814,7 +1796,7 @@
               <w:rPr>
                 <w:noProof/>
               </w:rPr>
-              <w:t>1</w:t>
+              <w:t>10</w:t>
             </w:r>
             <w:r>
               <w:rPr>
@@ -1875,7 +1857,7 @@
               <w:rPr>
                 <w:noProof/>
               </w:rPr>
-              <w:t>1</w:t>
+              <w:t>11</w:t>
             </w:r>
             <w:r>
               <w:rPr>
@@ -1936,7 +1918,7 @@
               <w:rPr>
                 <w:noProof/>
               </w:rPr>
-              <w:t>1</w:t>
+              <w:t>12</w:t>
             </w:r>
             <w:r>
               <w:rPr>
@@ -1997,7 +1979,7 @@
               <w:rPr>
                 <w:noProof/>
               </w:rPr>
-              <w:t>1</w:t>
+              <w:t>12</w:t>
             </w:r>
             <w:r>
               <w:rPr>
@@ -2058,7 +2040,7 @@
               <w:rPr>
                 <w:noProof/>
               </w:rPr>
-              <w:t>1</w:t>
+              <w:t>12</w:t>
             </w:r>
             <w:r>
               <w:rPr>
@@ -2119,7 +2101,7 @@
               <w:rPr>
                 <w:noProof/>
               </w:rPr>
-              <w:t>1</w:t>
+              <w:t>12</w:t>
             </w:r>
             <w:r>
               <w:rPr>
@@ -2180,7 +2162,7 @@
               <w:rPr>
                 <w:noProof/>
               </w:rPr>
-              <w:t>1</w:t>
+              <w:t>12</w:t>
             </w:r>
             <w:r>
               <w:rPr>
@@ -2241,7 +2223,7 @@
               <w:rPr>
                 <w:noProof/>
               </w:rPr>
-              <w:t>1</w:t>
+              <w:t>13</w:t>
             </w:r>
             <w:r>
               <w:rPr>
@@ -2302,7 +2284,7 @@
               <w:rPr>
                 <w:noProof/>
               </w:rPr>
-              <w:t>1</w:t>
+              <w:t>13</w:t>
             </w:r>
             <w:r>
               <w:rPr>
@@ -2363,7 +2345,7 @@
               <w:rPr>
                 <w:noProof/>
               </w:rPr>
-              <w:t>1</w:t>
+              <w:t>13</w:t>
             </w:r>
             <w:r>
               <w:rPr>
@@ -2424,7 +2406,7 @@
               <w:rPr>
                 <w:noProof/>
               </w:rPr>
-              <w:t>1</w:t>
+              <w:t>14</w:t>
             </w:r>
             <w:r>
               <w:rPr>
@@ -2485,7 +2467,7 @@
               <w:rPr>
                 <w:noProof/>
               </w:rPr>
-              <w:t>1</w:t>
+              <w:t>14</w:t>
             </w:r>
             <w:r>
               <w:rPr>
@@ -2546,7 +2528,7 @@
               <w:rPr>
                 <w:noProof/>
               </w:rPr>
-              <w:t>1</w:t>
+              <w:t>14</w:t>
             </w:r>
             <w:r>
               <w:rPr>
@@ -2607,7 +2589,7 @@
               <w:rPr>
                 <w:noProof/>
               </w:rPr>
-              <w:t>1</w:t>
+              <w:t>15</w:t>
             </w:r>
             <w:r>
               <w:rPr>
@@ -2668,7 +2650,7 @@
               <w:rPr>
                 <w:noProof/>
               </w:rPr>
-              <w:t>1</w:t>
+              <w:t>15</w:t>
             </w:r>
             <w:r>
               <w:rPr>
@@ -2729,7 +2711,7 @@
               <w:rPr>
                 <w:noProof/>
               </w:rPr>
-              <w:t>1</w:t>
+              <w:t>15</w:t>
             </w:r>
             <w:r>
               <w:rPr>
@@ -2790,7 +2772,7 @@
               <w:rPr>
                 <w:noProof/>
               </w:rPr>
-              <w:t>1</w:t>
+              <w:t>15</w:t>
             </w:r>
             <w:r>
               <w:rPr>
@@ -2851,7 +2833,7 @@
               <w:rPr>
                 <w:noProof/>
               </w:rPr>
-              <w:t>1</w:t>
+              <w:t>16</w:t>
             </w:r>
             <w:r>
               <w:rPr>
@@ -2912,7 +2894,7 @@
               <w:rPr>
                 <w:noProof/>
               </w:rPr>
-              <w:t>1</w:t>
+              <w:t>17</w:t>
             </w:r>
             <w:r>
               <w:rPr>
@@ -2973,7 +2955,7 @@
               <w:rPr>
                 <w:noProof/>
               </w:rPr>
-              <w:t>1</w:t>
+              <w:t>17</w:t>
             </w:r>
             <w:r>
               <w:rPr>
@@ -3034,7 +3016,7 @@
               <w:rPr>
                 <w:noProof/>
               </w:rPr>
-              <w:t>1</w:t>
+              <w:t>17</w:t>
             </w:r>
             <w:r>
               <w:rPr>
@@ -3095,7 +3077,7 @@
               <w:rPr>
                 <w:noProof/>
               </w:rPr>
-              <w:t>1</w:t>
+              <w:t>17</w:t>
             </w:r>
             <w:r>
               <w:rPr>
@@ -3156,7 +3138,7 @@
               <w:rPr>
                 <w:noProof/>
               </w:rPr>
-              <w:t>1</w:t>
+              <w:t>18</w:t>
             </w:r>
             <w:r>
               <w:rPr>
@@ -3184,6 +3166,7 @@
       </w:pPr>
       <w:bookmarkStart w:id="0" w:name="_Toc240728572"/>
       <w:r>
+        <w:lastRenderedPageBreak/>
         <w:t>1. Executive Summary</w:t>
       </w:r>
       <w:bookmarkEnd w:id="0"/>
@@ -3414,6 +3397,7 @@
       </w:pPr>
       <w:bookmarkStart w:id="6" w:name="_Toc240728578"/>
       <w:r>
+        <w:lastRenderedPageBreak/>
         <w:t>2. Company Overview</w:t>
       </w:r>
       <w:bookmarkEnd w:id="6"/>
@@ -3560,6 +3544,7 @@
       </w:pPr>
       <w:bookmarkStart w:id="8" w:name="_Toc240728580"/>
       <w:r>
+        <w:lastRenderedPageBreak/>
         <w:t>3. The Problem</w:t>
       </w:r>
       <w:bookmarkEnd w:id="8"/>
@@ -3567,55 +3552,8 @@
     <w:p>
       <w:pPr>
         <w:pStyle w:val="Heading2"/>
-        <w:rPr>
-          <w:b w:val="0"/>
-          <w:bCs w:val="0"/>
-          <w:i/>
-          <w:iCs/>
-          <w:color w:val="222B36"/>
-          <w:sz w:val="22"/>
-          <w:szCs w:val="22"/>
-        </w:rPr>
       </w:pPr>
       <w:bookmarkStart w:id="9" w:name="_Toc240728581"/>
-      <w:r>
-        <w:rPr>
-          <w:b w:val="0"/>
-          <w:bCs w:val="0"/>
-          <w:iCs/>
-          <w:color w:val="222B36"/>
-          <w:sz w:val="22"/>
-          <w:szCs w:val="22"/>
-        </w:rPr>
-        <w:t xml:space="preserve">On most sites today, hazards, near misses, and incidents are logged on paper forms, whiteboards, or generic systems built for the office rather than the field. A worker who spots a hazard </w:t>
-      </w:r>
-      <w:r>
-        <w:rPr>
-          <w:b w:val="0"/>
-          <w:bCs w:val="0"/>
-          <w:iCs/>
-          <w:color w:val="222B36"/>
-          <w:sz w:val="22"/>
-          <w:szCs w:val="22"/>
-        </w:rPr>
-        <w:t>must</w:t>
-      </w:r>
-      <w:r>
-        <w:rPr>
-          <w:b w:val="0"/>
-          <w:bCs w:val="0"/>
-          <w:iCs/>
-          <w:color w:val="222B36"/>
-          <w:sz w:val="22"/>
-          <w:szCs w:val="22"/>
-        </w:rPr>
-        <w:t xml:space="preserve"> stop, find a form or a computer, and fill out paperwork, often at the end of a shift, if at all. The reports that do get filed then sit in binders or disconnected spreadsheets where supervisors can't easily triage them, track them to resolution, or learn from them. The result is a reporting gap where the most valuable early-warning signals, near misses and hazards, are the least likely to be captured.</w:t>
-      </w:r>
-    </w:p>
-    <w:p>
-      <w:pPr>
-        <w:pStyle w:val="Heading2"/>
-      </w:pPr>
       <w:r>
         <w:t>The reporting gap</w:t>
       </w:r>
@@ -3661,7 +3599,21 @@
         <w:rPr>
           <w:iCs/>
         </w:rPr>
-        <w:t xml:space="preserve"> Industry research and decades of safety practice consistently find that the majority of near misses and hazards go unreported, and those are exactly the early-warning signals that precede serious incidents. </w:t>
+        <w:t xml:space="preserve"> Industry research and decades of safety practice consistently find that </w:t>
+      </w:r>
+      <w:proofErr w:type="gramStart"/>
+      <w:r>
+        <w:rPr>
+          <w:iCs/>
+        </w:rPr>
+        <w:t>the majority of</w:t>
+      </w:r>
+      <w:proofErr w:type="gramEnd"/>
+      <w:r>
+        <w:rPr>
+          <w:iCs/>
+        </w:rPr>
+        <w:t xml:space="preserve"> near misses and hazards go unreported, and those are exactly the early-warning signals that precede serious incidents. </w:t>
       </w:r>
       <w:r>
         <w:rPr>
@@ -3812,6 +3764,7 @@
       </w:pPr>
       <w:bookmarkStart w:id="11" w:name="_Toc240728583"/>
       <w:r>
+        <w:lastRenderedPageBreak/>
         <w:t>4. Solution &amp; Product</w:t>
       </w:r>
       <w:bookmarkEnd w:id="11"/>
@@ -3985,10 +3938,7 @@
       </w:pPr>
       <w:bookmarkStart w:id="14" w:name="_Toc240728586"/>
       <w:r>
-        <w:t xml:space="preserve">What makes it </w:t>
-      </w:r>
-      <w:r>
-        <w:t>different</w:t>
+        <w:t>What makes it different</w:t>
       </w:r>
       <w:bookmarkEnd w:id="14"/>
     </w:p>
@@ -4033,6 +3983,7 @@
       </w:pPr>
       <w:bookmarkStart w:id="15" w:name="_Toc240728587"/>
       <w:r>
+        <w:lastRenderedPageBreak/>
         <w:t>5. Market Opportunity</w:t>
       </w:r>
       <w:bookmarkEnd w:id="15"/>
@@ -4660,6 +4611,7 @@
       </w:pPr>
       <w:bookmarkStart w:id="18" w:name="_Toc240728590"/>
       <w:r>
+        <w:lastRenderedPageBreak/>
         <w:t>6. Business Model</w:t>
       </w:r>
       <w:bookmarkEnd w:id="18"/>
@@ -4730,6 +4682,17 @@
       <w:r>
         <w:t xml:space="preserve"> Pilot Period is over.</w:t>
       </w:r>
+      <w:r>
+        <w:t xml:space="preserve"> </w:t>
+      </w:r>
+      <w:hyperlink r:id="rId10" w:history="1">
+        <w:r>
+          <w:rPr>
+            <w:rStyle w:val="Hyperlink"/>
+          </w:rPr>
+          <w:t>Statera | Safety reporting for mine sites</w:t>
+        </w:r>
+      </w:hyperlink>
     </w:p>
     <w:p>
       <w:pPr>
@@ -5225,6 +5188,7 @@
         <w:rPr>
           <w:iCs/>
         </w:rPr>
+        <w:lastRenderedPageBreak/>
         <w:t>Source: industry conferences (AEAC / ISSA), IMII and mentor/advisor introductions, and the</w:t>
       </w:r>
       <w:r>
@@ -5340,10 +5304,7 @@
       </w:pPr>
       <w:bookmarkStart w:id="23" w:name="_Toc240728595"/>
       <w:r>
-        <w:t>Pilot appr</w:t>
-      </w:r>
-      <w:r>
-        <w:t>oach</w:t>
+        <w:t>Pilot approach</w:t>
       </w:r>
       <w:bookmarkEnd w:id="23"/>
     </w:p>
@@ -5550,6 +5511,7 @@
       </w:pPr>
       <w:bookmarkStart w:id="25" w:name="_Toc240728597"/>
       <w:r>
+        <w:lastRenderedPageBreak/>
         <w:t>8. Competitive Landscape</w:t>
       </w:r>
       <w:bookmarkEnd w:id="25"/>
@@ -6016,7 +5978,21 @@
         <w:rPr>
           <w:iCs/>
         </w:rPr>
-        <w:t>Today most sites still run on paper forms, spreadsheets, or a generic EHS tool built for the compliance office. Because none of these make reporting fast and frictionless for the frontline worker, the majority of hazards and near misses never get logged.</w:t>
+        <w:t xml:space="preserve">Today most sites still run on paper forms, spreadsheets, or a generic EHS tool built for the compliance office. Because none of these make reporting fast and frictionless for the frontline worker, </w:t>
+      </w:r>
+      <w:proofErr w:type="gramStart"/>
+      <w:r>
+        <w:rPr>
+          <w:iCs/>
+        </w:rPr>
+        <w:t>the majority of</w:t>
+      </w:r>
+      <w:proofErr w:type="gramEnd"/>
+      <w:r>
+        <w:rPr>
+          <w:iCs/>
+        </w:rPr>
+        <w:t xml:space="preserve"> hazards and near misses never get logged.</w:t>
       </w:r>
       <w:r>
         <w:br w:type="page"/>
@@ -6028,6 +6004,7 @@
       </w:pPr>
       <w:bookmarkStart w:id="26" w:name="_Toc240728598"/>
       <w:r>
+        <w:lastRenderedPageBreak/>
         <w:t>9. Technology, Data Security &amp; Compliance</w:t>
       </w:r>
       <w:bookmarkEnd w:id="26"/>
@@ -6281,6 +6258,7 @@
       </w:pPr>
       <w:bookmarkStart w:id="31" w:name="_Toc240728603"/>
       <w:r>
+        <w:lastRenderedPageBreak/>
         <w:t>10. Traction &amp; Roadmap</w:t>
       </w:r>
       <w:bookmarkEnd w:id="31"/>
@@ -6291,10 +6269,7 @@
       </w:pPr>
       <w:bookmarkStart w:id="32" w:name="_Toc240728604"/>
       <w:r>
-        <w:t>Tr</w:t>
-      </w:r>
-      <w:r>
-        <w:t>action so far</w:t>
+        <w:t>Traction so far</w:t>
       </w:r>
       <w:bookmarkEnd w:id="32"/>
     </w:p>
@@ -6504,17 +6479,7 @@
                 <w:sz w:val="20"/>
                 <w:szCs w:val="20"/>
               </w:rPr>
-              <w:t>S</w:t>
-            </w:r>
-            <w:r>
-              <w:rPr>
-                <w:b/>
-                <w:bCs/>
-                <w:color w:val="FFFFFF"/>
-                <w:sz w:val="20"/>
-                <w:szCs w:val="20"/>
-              </w:rPr>
-              <w:t>uccess measure</w:t>
+              <w:t>Success measure</w:t>
             </w:r>
           </w:p>
         </w:tc>
@@ -6761,6 +6726,7 @@
       </w:pPr>
       <w:bookmarkStart w:id="34" w:name="_Toc240728606"/>
       <w:r>
+        <w:lastRenderedPageBreak/>
         <w:t>11. Team</w:t>
       </w:r>
       <w:bookmarkEnd w:id="34"/>
@@ -6973,10 +6939,7 @@
       </w:pPr>
       <w:bookmarkStart w:id="36" w:name="_Toc240728608"/>
       <w:r>
-        <w:t>Advisors &amp; mentor</w:t>
-      </w:r>
-      <w:r>
-        <w:t>s</w:t>
+        <w:t>Advisors &amp; mentors</w:t>
       </w:r>
       <w:bookmarkEnd w:id="36"/>
     </w:p>
@@ -7295,6 +7258,7 @@
       </w:pPr>
       <w:bookmarkStart w:id="37" w:name="_Toc240728609"/>
       <w:r>
+        <w:lastRenderedPageBreak/>
         <w:t>12. Financial Plan</w:t>
       </w:r>
       <w:bookmarkEnd w:id="37"/>
@@ -7971,6 +7935,7 @@
       </w:pPr>
       <w:bookmarkStart w:id="41" w:name="_Toc240728613"/>
       <w:r>
+        <w:lastRenderedPageBreak/>
         <w:t>13. Risks &amp; Mitigations</w:t>
       </w:r>
       <w:bookmarkEnd w:id="41"/>
@@ -8074,17 +8039,7 @@
                 <w:sz w:val="20"/>
                 <w:szCs w:val="20"/>
               </w:rPr>
-              <w:t>Our mitigat</w:t>
-            </w:r>
-            <w:r>
-              <w:rPr>
-                <w:b/>
-                <w:bCs/>
-                <w:color w:val="FFFFFF"/>
-                <w:sz w:val="20"/>
-                <w:szCs w:val="20"/>
-              </w:rPr>
-              <w:t>ion</w:t>
+              <w:t>Our mitigation</w:t>
             </w:r>
           </w:p>
         </w:tc>
@@ -8475,10 +8430,8 @@
       </w:pPr>
       <w:bookmarkStart w:id="42" w:name="_Toc240728614"/>
       <w:r>
-        <w:t>14.</w:t>
-      </w:r>
-      <w:r>
-        <w:t xml:space="preserve"> The Ask &amp; Next Step</w:t>
+        <w:lastRenderedPageBreak/>
+        <w:t>14. The Ask &amp; Next Step</w:t>
       </w:r>
       <w:bookmarkEnd w:id="42"/>
     </w:p>
@@ -8585,6 +8538,7 @@
       </w:pPr>
       <w:bookmarkStart w:id="46" w:name="_Toc240728618"/>
       <w:r>
+        <w:lastRenderedPageBreak/>
         <w:t>15. Appendix</w:t>
       </w:r>
       <w:bookmarkEnd w:id="46"/>
@@ -9442,7 +9396,7 @@
                   <wp:cNvGraphicFramePr/>
                   <a:graphic xmlns:a="http://schemas.openxmlformats.org/drawingml/2006/main">
                     <a:graphicData uri="http://schemas.openxmlformats.org/drawingml/2006/chart">
-                      <c:chart xmlns:c="http://schemas.openxmlformats.org/drawingml/2006/chart" xmlns:r="http://schemas.openxmlformats.org/officeDocument/2006/relationships" r:id="rId10"/>
+                      <c:chart xmlns:c="http://schemas.openxmlformats.org/drawingml/2006/chart" xmlns:r="http://schemas.openxmlformats.org/officeDocument/2006/relationships" r:id="rId11"/>
                     </a:graphicData>
                   </a:graphic>
                   <wp14:sizeRelH relativeFrom="page">
@@ -10550,6 +10504,7 @@
                 <w:color w:val="FFFFFF"/>
               </w:rPr>
             </w:pPr>
+            <w:proofErr w:type="gramStart"/>
             <w:r>
               <w:rPr>
                 <w:rFonts w:eastAsia="Arial" w:cs="Arial"/>
@@ -10557,7 +10512,17 @@
                 <w:bCs/>
                 <w:color w:val="FFFFFF"/>
               </w:rPr>
-              <w:t>PROJECTION  (P&amp;L)</w:t>
+              <w:t>PROJECTION  (</w:t>
+            </w:r>
+            <w:proofErr w:type="gramEnd"/>
+            <w:r>
+              <w:rPr>
+                <w:rFonts w:eastAsia="Arial" w:cs="Arial"/>
+                <w:b/>
+                <w:bCs/>
+                <w:color w:val="FFFFFF"/>
+              </w:rPr>
+              <w:t>P&amp;L)</w:t>
             </w:r>
           </w:p>
         </w:tc>
@@ -13078,7 +13043,27 @@
                 <w:bCs/>
                 <w:color w:val="FFFFFF"/>
               </w:rPr>
-              <w:t>PER-SITE UNIT ECONOMICS  (steady state, Yr 3)</w:t>
+              <w:t xml:space="preserve">PER-SITE UNIT </w:t>
+            </w:r>
+            <w:proofErr w:type="gramStart"/>
+            <w:r>
+              <w:rPr>
+                <w:rFonts w:eastAsia="Arial" w:cs="Arial"/>
+                <w:b/>
+                <w:bCs/>
+                <w:color w:val="FFFFFF"/>
+              </w:rPr>
+              <w:t>ECONOMICS  (</w:t>
+            </w:r>
+            <w:proofErr w:type="gramEnd"/>
+            <w:r>
+              <w:rPr>
+                <w:rFonts w:eastAsia="Arial" w:cs="Arial"/>
+                <w:b/>
+                <w:bCs/>
+                <w:color w:val="FFFFFF"/>
+              </w:rPr>
+              <w:t>steady state, Yr 3)</w:t>
             </w:r>
           </w:p>
         </w:tc>
@@ -15260,25 +15245,10 @@
                 <w:sz w:val="18"/>
                 <w:szCs w:val="18"/>
               </w:rPr>
-              <w:t>Legend:  blue = input you can change  ·  yellow = key lever  ·  black = calculated. Figures are estimates/targets to validate in pilots.</w:t>
-            </w:r>
-          </w:p>
-        </w:tc>
-        <w:tc>
-          <w:tcPr>
-            <w:tcW w:w="976" w:type="dxa"/>
-            <w:tcBorders>
-              <w:top w:val="nil"/>
-              <w:left w:val="nil"/>
-              <w:bottom w:val="nil"/>
-              <w:right w:val="nil"/>
-            </w:tcBorders>
-            <w:noWrap/>
-            <w:vAlign w:val="bottom"/>
-            <w:hideMark/>
-          </w:tcPr>
-          <w:p>
-            <w:pPr>
+              <w:t xml:space="preserve">Legend:  blue = input you can </w:t>
+            </w:r>
+            <w:proofErr w:type="gramStart"/>
+            <w:r>
               <w:rPr>
                 <w:rFonts w:eastAsia="Arial" w:cs="Arial"/>
                 <w:i/>
@@ -15287,6 +15257,69 @@
                 <w:sz w:val="18"/>
                 <w:szCs w:val="18"/>
               </w:rPr>
+              <w:t>change  ·</w:t>
+            </w:r>
+            <w:proofErr w:type="gramEnd"/>
+            <w:r>
+              <w:rPr>
+                <w:rFonts w:eastAsia="Arial" w:cs="Arial"/>
+                <w:i/>
+                <w:iCs/>
+                <w:color w:val="666666"/>
+                <w:sz w:val="18"/>
+                <w:szCs w:val="18"/>
+              </w:rPr>
+              <w:t xml:space="preserve">  yellow = key </w:t>
+            </w:r>
+            <w:proofErr w:type="gramStart"/>
+            <w:r>
+              <w:rPr>
+                <w:rFonts w:eastAsia="Arial" w:cs="Arial"/>
+                <w:i/>
+                <w:iCs/>
+                <w:color w:val="666666"/>
+                <w:sz w:val="18"/>
+                <w:szCs w:val="18"/>
+              </w:rPr>
+              <w:t>lever  ·</w:t>
+            </w:r>
+            <w:proofErr w:type="gramEnd"/>
+            <w:r>
+              <w:rPr>
+                <w:rFonts w:eastAsia="Arial" w:cs="Arial"/>
+                <w:i/>
+                <w:iCs/>
+                <w:color w:val="666666"/>
+                <w:sz w:val="18"/>
+                <w:szCs w:val="18"/>
+              </w:rPr>
+              <w:t xml:space="preserve">  black = calculated. Figures are estimates/targets to validate in pilots.</w:t>
+            </w:r>
+          </w:p>
+        </w:tc>
+        <w:tc>
+          <w:tcPr>
+            <w:tcW w:w="976" w:type="dxa"/>
+            <w:tcBorders>
+              <w:top w:val="nil"/>
+              <w:left w:val="nil"/>
+              <w:bottom w:val="nil"/>
+              <w:right w:val="nil"/>
+            </w:tcBorders>
+            <w:noWrap/>
+            <w:vAlign w:val="bottom"/>
+            <w:hideMark/>
+          </w:tcPr>
+          <w:p>
+            <w:pPr>
+              <w:rPr>
+                <w:rFonts w:eastAsia="Arial" w:cs="Arial"/>
+                <w:i/>
+                <w:iCs/>
+                <w:color w:val="666666"/>
+                <w:sz w:val="18"/>
+                <w:szCs w:val="18"/>
+              </w:rPr>
             </w:pPr>
           </w:p>
         </w:tc>
@@ -15858,6 +15891,7 @@
         <w:rPr>
           <w:noProof/>
         </w:rPr>
+        <w:lastRenderedPageBreak/>
         <w:drawing>
           <wp:inline distT="0" distB="0" distL="0" distR="0" wp14:anchorId="66D48DB4" wp14:editId="515414F7">
             <wp:extent cx="6534648" cy="3067050"/>
@@ -15874,7 +15908,7 @@
                     <pic:cNvPicPr/>
                   </pic:nvPicPr>
                   <pic:blipFill>
-                    <a:blip r:embed="rId11"/>
+                    <a:blip r:embed="rId12"/>
                     <a:stretch>
                       <a:fillRect/>
                     </a:stretch>
@@ -15940,7 +15974,7 @@
                     </pic:cNvPicPr>
                   </pic:nvPicPr>
                   <pic:blipFill>
-                    <a:blip r:embed="rId12" cstate="print">
+                    <a:blip r:embed="rId13" cstate="print">
                       <a:extLst>
                         <a:ext uri="{28A0092B-C50C-407E-A947-70E740481C1C}">
                           <a14:useLocalDpi xmlns:a14="http://schemas.microsoft.com/office/drawing/2010/main" val="0"/>
@@ -15981,6 +16015,7 @@
         <w:rPr>
           <w:noProof/>
         </w:rPr>
+        <w:lastRenderedPageBreak/>
         <w:drawing>
           <wp:inline distT="0" distB="0" distL="0" distR="0" wp14:anchorId="0B3146A8" wp14:editId="12CCA59E">
             <wp:extent cx="6397375" cy="3601941"/>
@@ -15999,7 +16034,7 @@
                     </pic:cNvPicPr>
                   </pic:nvPicPr>
                   <pic:blipFill>
-                    <a:blip r:embed="rId13" cstate="print">
+                    <a:blip r:embed="rId14" cstate="print">
                       <a:extLst>
                         <a:ext uri="{28A0092B-C50C-407E-A947-70E740481C1C}">
                           <a14:useLocalDpi xmlns:a14="http://schemas.microsoft.com/office/drawing/2010/main" val="0"/>
@@ -16058,7 +16093,7 @@
                     </pic:cNvPicPr>
                   </pic:nvPicPr>
                   <pic:blipFill>
-                    <a:blip r:embed="rId14" cstate="print">
+                    <a:blip r:embed="rId15" cstate="print">
                       <a:extLst>
                         <a:ext uri="{28A0092B-C50C-407E-A947-70E740481C1C}">
                           <a14:useLocalDpi xmlns:a14="http://schemas.microsoft.com/office/drawing/2010/main" val="0"/>
@@ -16099,6 +16134,7 @@
         <w:rPr>
           <w:noProof/>
         </w:rPr>
+        <w:lastRenderedPageBreak/>
         <w:drawing>
           <wp:inline distT="0" distB="0" distL="0" distR="0" wp14:anchorId="1E408F65" wp14:editId="7B99C455">
             <wp:extent cx="6452387" cy="3586038"/>
@@ -16117,7 +16153,7 @@
                     </pic:cNvPicPr>
                   </pic:nvPicPr>
                   <pic:blipFill>
-                    <a:blip r:embed="rId15" cstate="print">
+                    <a:blip r:embed="rId16" cstate="print">
                       <a:extLst>
                         <a:ext uri="{28A0092B-C50C-407E-A947-70E740481C1C}">
                           <a14:useLocalDpi xmlns:a14="http://schemas.microsoft.com/office/drawing/2010/main" val="0"/>
@@ -16176,7 +16212,7 @@
                     </pic:cNvPicPr>
                   </pic:nvPicPr>
                   <pic:blipFill>
-                    <a:blip r:embed="rId16" cstate="print">
+                    <a:blip r:embed="rId17" cstate="print">
                       <a:extLst>
                         <a:ext uri="{28A0092B-C50C-407E-A947-70E740481C1C}">
                           <a14:useLocalDpi xmlns:a14="http://schemas.microsoft.com/office/drawing/2010/main" val="0"/>
@@ -16217,8 +16253,9 @@
         <w:rPr>
           <w:noProof/>
         </w:rPr>
+        <w:lastRenderedPageBreak/>
         <w:drawing>
-          <wp:inline distT="0" distB="0" distL="0" distR="0" wp14:anchorId="22BE7053" wp14:editId="4D737281">
+          <wp:inline distT="0" distB="0" distL="0" distR="0" wp14:anchorId="22BE7053" wp14:editId="07212791">
             <wp:extent cx="5943600" cy="1839595"/>
             <wp:effectExtent l="0" t="0" r="0" b="8255"/>
             <wp:docPr id="1497264409" name="Picture 11"/>
@@ -16235,7 +16272,7 @@
                     </pic:cNvPicPr>
                   </pic:nvPicPr>
                   <pic:blipFill>
-                    <a:blip r:embed="rId17" cstate="print">
+                    <a:blip r:embed="rId18" cstate="print">
                       <a:extLst>
                         <a:ext uri="{28A0092B-C50C-407E-A947-70E740481C1C}">
                           <a14:useLocalDpi xmlns:a14="http://schemas.microsoft.com/office/drawing/2010/main" val="0"/>
@@ -16294,7 +16331,7 @@
                     </pic:cNvPicPr>
                   </pic:nvPicPr>
                   <pic:blipFill>
-                    <a:blip r:embed="rId18">
+                    <a:blip r:embed="rId19">
                       <a:extLst>
                         <a:ext uri="{28A0092B-C50C-407E-A947-70E740481C1C}">
                           <a14:useLocalDpi xmlns:a14="http://schemas.microsoft.com/office/drawing/2010/main" val="0"/>
@@ -16374,7 +16411,7 @@
         </w:numPr>
         <w:spacing w:after="60" w:line="276" w:lineRule="auto"/>
       </w:pPr>
-      <w:hyperlink r:id="rId19" w:history="1">
+      <w:hyperlink r:id="rId20" w:history="1">
         <w:r>
           <w:rPr>
             <w:rStyle w:val="Hyperlink"/>
@@ -16392,7 +16429,7 @@
         </w:numPr>
         <w:spacing w:after="60" w:line="276" w:lineRule="auto"/>
       </w:pPr>
-      <w:hyperlink r:id="rId20" w:history="1">
+      <w:hyperlink r:id="rId21" w:history="1">
         <w:r>
           <w:rPr>
             <w:rStyle w:val="Hyperlink"/>
@@ -16418,7 +16455,7 @@
         </w:numPr>
         <w:spacing w:after="60" w:line="276" w:lineRule="auto"/>
       </w:pPr>
-      <w:hyperlink r:id="rId21" w:history="1">
+      <w:hyperlink r:id="rId22" w:history="1">
         <w:r>
           <w:rPr>
             <w:rStyle w:val="Hyperlink"/>
@@ -16436,7 +16473,7 @@
         </w:numPr>
         <w:spacing w:after="60" w:line="276" w:lineRule="auto"/>
       </w:pPr>
-      <w:hyperlink r:id="rId22" w:history="1">
+      <w:hyperlink r:id="rId23" w:history="1">
         <w:r>
           <w:rPr>
             <w:rStyle w:val="Hyperlink"/>
@@ -16454,7 +16491,7 @@
         </w:numPr>
         <w:spacing w:after="60" w:line="276" w:lineRule="auto"/>
       </w:pPr>
-      <w:hyperlink r:id="rId23" w:history="1">
+      <w:hyperlink r:id="rId24" w:history="1">
         <w:r>
           <w:rPr>
             <w:rStyle w:val="Hyperlink"/>
@@ -16465,13 +16502,6 @@
       <w:r>
         <w:t xml:space="preserve"> </w:t>
       </w:r>
-      <w:r>
-        <w:rPr>
-          <w:i/>
-          <w:iCs/>
-        </w:rPr>
-        <w:t>(vendor-sourced — attribute if you cite the 90%)</w:t>
-      </w:r>
     </w:p>
     <w:p>
       <w:pPr>
@@ -16509,7 +16539,7 @@
         </w:numPr>
         <w:spacing w:after="60" w:line="276" w:lineRule="auto"/>
       </w:pPr>
-      <w:hyperlink r:id="rId24" w:history="1">
+      <w:hyperlink r:id="rId25" w:history="1">
         <w:r>
           <w:rPr>
             <w:rStyle w:val="Hyperlink"/>
@@ -16527,7 +16557,7 @@
         </w:numPr>
         <w:spacing w:after="60" w:line="276" w:lineRule="auto"/>
       </w:pPr>
-      <w:hyperlink r:id="rId25" w:history="1">
+      <w:hyperlink r:id="rId26" w:history="1">
         <w:r>
           <w:rPr>
             <w:rStyle w:val="Hyperlink"/>
@@ -16545,7 +16575,7 @@
         </w:numPr>
         <w:spacing w:after="60" w:line="276" w:lineRule="auto"/>
       </w:pPr>
-      <w:hyperlink r:id="rId26" w:history="1">
+      <w:hyperlink r:id="rId27" w:history="1">
         <w:r>
           <w:rPr>
             <w:rStyle w:val="Hyperlink"/>
@@ -16576,7 +16606,7 @@
         </w:numPr>
         <w:spacing w:after="60" w:line="276" w:lineRule="auto"/>
       </w:pPr>
-      <w:hyperlink r:id="rId27" w:history="1">
+      <w:hyperlink r:id="rId28" w:history="1">
         <w:r>
           <w:rPr>
             <w:rStyle w:val="Hyperlink"/>
@@ -16607,7 +16637,7 @@
         </w:numPr>
         <w:spacing w:after="60" w:line="276" w:lineRule="auto"/>
       </w:pPr>
-      <w:hyperlink r:id="rId28" w:history="1">
+      <w:hyperlink r:id="rId29" w:history="1">
         <w:r>
           <w:rPr>
             <w:rStyle w:val="Hyperlink"/>
@@ -16625,7 +16655,7 @@
         </w:numPr>
         <w:spacing w:after="60" w:line="276" w:lineRule="auto"/>
       </w:pPr>
-      <w:hyperlink r:id="rId29" w:history="1">
+      <w:hyperlink r:id="rId30" w:history="1">
         <w:r>
           <w:rPr>
             <w:rStyle w:val="Hyperlink"/>
@@ -16643,7 +16673,7 @@
         </w:numPr>
         <w:spacing w:after="60" w:line="276" w:lineRule="auto"/>
       </w:pPr>
-      <w:hyperlink r:id="rId30" w:history="1">
+      <w:hyperlink r:id="rId31" w:history="1">
         <w:r>
           <w:rPr>
             <w:rStyle w:val="Hyperlink"/>
@@ -16674,7 +16704,7 @@
         </w:numPr>
         <w:spacing w:after="60" w:line="276" w:lineRule="auto"/>
       </w:pPr>
-      <w:hyperlink r:id="rId31" w:history="1">
+      <w:hyperlink r:id="rId32" w:history="1">
         <w:r>
           <w:rPr>
             <w:rStyle w:val="Hyperlink"/>
@@ -16692,7 +16722,7 @@
         </w:numPr>
         <w:spacing w:after="60" w:line="276" w:lineRule="auto"/>
       </w:pPr>
-      <w:hyperlink r:id="rId32" w:history="1">
+      <w:hyperlink r:id="rId33" w:history="1">
         <w:r>
           <w:rPr>
             <w:rStyle w:val="Hyperlink"/>
@@ -16710,7 +16740,7 @@
         </w:numPr>
         <w:spacing w:after="60" w:line="276" w:lineRule="auto"/>
       </w:pPr>
-      <w:hyperlink r:id="rId33" w:history="1">
+      <w:hyperlink r:id="rId34" w:history="1">
         <w:r>
           <w:rPr>
             <w:rStyle w:val="Hyperlink"/>
@@ -16741,7 +16771,7 @@
         </w:numPr>
         <w:spacing w:after="60" w:line="276" w:lineRule="auto"/>
       </w:pPr>
-      <w:hyperlink r:id="rId34" w:history="1">
+      <w:hyperlink r:id="rId35" w:history="1">
         <w:r>
           <w:rPr>
             <w:rStyle w:val="Hyperlink"/>
@@ -16759,7 +16789,7 @@
         </w:numPr>
         <w:spacing w:after="60" w:line="276" w:lineRule="auto"/>
       </w:pPr>
-      <w:hyperlink r:id="rId35" w:history="1">
+      <w:hyperlink r:id="rId36" w:history="1">
         <w:r>
           <w:rPr>
             <w:rStyle w:val="Hyperlink"/>
@@ -16798,7 +16828,7 @@
         </w:numPr>
         <w:spacing w:after="60" w:line="276" w:lineRule="auto"/>
       </w:pPr>
-      <w:hyperlink r:id="rId36" w:history="1">
+      <w:hyperlink r:id="rId37" w:history="1">
         <w:r>
           <w:rPr>
             <w:rStyle w:val="Hyperlink"/>
@@ -16816,7 +16846,7 @@
         </w:numPr>
         <w:spacing w:after="60" w:line="276" w:lineRule="auto"/>
       </w:pPr>
-      <w:hyperlink r:id="rId37" w:history="1">
+      <w:hyperlink r:id="rId38" w:history="1">
         <w:r>
           <w:rPr>
             <w:rStyle w:val="Hyperlink"/>
@@ -16832,10 +16862,7 @@
       </w:pPr>
     </w:p>
     <w:sectPr>
-      <w:headerReference w:type="default" r:id="rId38"/>
       <w:footerReference w:type="default" r:id="rId39"/>
-      <w:headerReference w:type="first" r:id="rId40"/>
-      <w:footerReference w:type="first" r:id="rId41"/>
       <w:pgSz w:w="12240" w:h="15840"/>
       <w:pgMar w:top="1440" w:right="1440" w:bottom="1440" w:left="1440" w:header="708" w:footer="708" w:gutter="0"/>
       <w:cols w:space="720"/>
@@ -16975,16 +17002,6 @@
 </w:ftr>
 </file>
 
-<file path=word/footer2.xml><?xml version="1.0" encoding="utf-8"?>
-<w:ftr xmlns:wpc="http://schemas.microsoft.com/office/word/2010/wordprocessingCanvas" xmlns:cx="http://schemas.microsoft.com/office/drawing/2014/chartex" xmlns:cx1="http://schemas.microsoft.com/office/drawing/2015/9/8/chartex" xmlns:cx2="http://schemas.microsoft.com/office/drawing/2015/10/21/chartex" xmlns:cx3="http://schemas.microsoft.com/office/drawing/2016/5/9/chartex" xmlns:cx4="http://schemas.microsoft.com/office/drawing/2016/5/10/chartex" xmlns:cx5="http://schemas.microsoft.com/office/drawing/2016/5/11/chartex" xmlns:cx6="http://schemas.microsoft.com/office/drawing/2016/5/12/chartex" xmlns:cx7="http://schemas.microsoft.com/office/drawing/2016/5/13/chartex" xmlns:cx8="http://schemas.microsoft.com/office/drawing/2016/5/14/chartex" xmlns:mc="http://schemas.openxmlformats.org/markup-compatibility/2006" xmlns:aink="http://schemas.microsoft.com/office/drawing/2016/ink" xmlns:am3d="http://schemas.microsoft.com/office/drawing/2017/model3d" xmlns:o="urn:schemas-microsoft-com:office:office" xmlns:oel="http://schemas.microsoft.com/office/2019/extlst" xmlns:r="http://schemas.openxmlformats.org/officeDocument/2006/relationships" xmlns:m="http://schemas.openxmlformats.org/officeDocument/2006/math" xmlns:v="urn:schemas-microsoft-com:vml" xmlns:wp14="http://schemas.microsoft.com/office/word/2010/wordprocessingDrawing" xmlns:wp="http://schemas.openxmlformats.org/drawingml/2006/wordprocessingDrawing" xmlns:w10="urn:schemas-microsoft-com:office:word" xmlns:w="http://schemas.openxmlformats.org/wordprocessingml/2006/main" xmlns:w14="http://schemas.microsoft.com/office/word/2010/wordml" xmlns:w15="http://schemas.microsoft.com/office/word/2012/wordml" xmlns:w16cex="http://schemas.microsoft.com/office/word/2018/wordml/cex" xmlns:w16cid="http://schemas.microsoft.com/office/word/2016/wordml/cid" xmlns:w16="http://schemas.microsoft.com/office/word/2018/wordml" xmlns:w16du="http://schemas.microsoft.com/office/word/2023/wordml/word16du" xmlns:w16sdtdh="http://schemas.microsoft.com/office/word/2020/wordml/sdtdatahash" xmlns:w16sdtfl="http://schemas.microsoft.com/office/word/2024/wordml/sdtformatlock" xmlns:w16se="http://schemas.microsoft.com/office/word/2015/wordml/symex" xmlns:wpg="http://schemas.microsoft.com/office/word/2010/wordprocessingGroup" xmlns:wpi="http://schemas.microsoft.com/office/word/2010/wordprocessingInk" xmlns:wne="http://schemas.microsoft.com/office/word/2006/wordml" xmlns:wps="http://schemas.microsoft.com/office/word/2010/wordprocessingShape" mc:Ignorable="w14 w15 w16se w16cid w16 w16cex w16sdtdh w16sdtfl w16du wp14">
-  <w:p>
-    <w:pPr>
-      <w:pStyle w:val="Footer"/>
-    </w:pPr>
-  </w:p>
-</w:ftr>
-</file>
-
 <file path=word/footnotes.xml><?xml version="1.0" encoding="utf-8"?>
 <w:footnotes xmlns:wpc="http://schemas.microsoft.com/office/word/2010/wordprocessingCanvas" xmlns:cx="http://schemas.microsoft.com/office/drawing/2014/chartex" xmlns:cx1="http://schemas.microsoft.com/office/drawing/2015/9/8/chartex" xmlns:cx2="http://schemas.microsoft.com/office/drawing/2015/10/21/chartex" xmlns:cx3="http://schemas.microsoft.com/office/drawing/2016/5/9/chartex" xmlns:cx4="http://schemas.microsoft.com/office/drawing/2016/5/10/chartex" xmlns:cx5="http://schemas.microsoft.com/office/drawing/2016/5/11/chartex" xmlns:cx6="http://schemas.microsoft.com/office/drawing/2016/5/12/chartex" xmlns:cx7="http://schemas.microsoft.com/office/drawing/2016/5/13/chartex" xmlns:cx8="http://schemas.microsoft.com/office/drawing/2016/5/14/chartex" xmlns:mc="http://schemas.openxmlformats.org/markup-compatibility/2006" xmlns:aink="http://schemas.microsoft.com/office/drawing/2016/ink" xmlns:am3d="http://schemas.microsoft.com/office/drawing/2017/model3d" xmlns:o="urn:schemas-microsoft-com:office:office" xmlns:oel="http://schemas.microsoft.com/office/2019/extlst" xmlns:r="http://schemas.openxmlformats.org/officeDocument/2006/relationships" xmlns:m="http://schemas.openxmlformats.org/officeDocument/2006/math" xmlns:v="urn:schemas-microsoft-com:vml" xmlns:wp14="http://schemas.microsoft.com/office/word/2010/wordprocessingDrawing" xmlns:wp="http://schemas.openxmlformats.org/drawingml/2006/wordprocessingDrawing" xmlns:w10="urn:schemas-microsoft-com:office:word" xmlns:w="http://schemas.openxmlformats.org/wordprocessingml/2006/main" xmlns:w14="http://schemas.microsoft.com/office/word/2010/wordml" xmlns:w15="http://schemas.microsoft.com/office/word/2012/wordml" xmlns:w16cex="http://schemas.microsoft.com/office/word/2018/wordml/cex" xmlns:w16cid="http://schemas.microsoft.com/office/word/2016/wordml/cid" xmlns:w16="http://schemas.microsoft.com/office/word/2018/wordml" xmlns:w16du="http://schemas.microsoft.com/office/word/2023/wordml/word16du" xmlns:w16sdtdh="http://schemas.microsoft.com/office/word/2020/wordml/sdtdatahash" xmlns:w16sdtfl="http://schemas.microsoft.com/office/word/2024/wordml/sdtformatlock" xmlns:w16se="http://schemas.microsoft.com/office/word/2015/wordml/symex" xmlns:wpg="http://schemas.microsoft.com/office/word/2010/wordprocessingGroup" xmlns:wpi="http://schemas.microsoft.com/office/word/2010/wordprocessingInk" xmlns:wne="http://schemas.microsoft.com/office/word/2006/wordml" xmlns:wps="http://schemas.microsoft.com/office/word/2010/wordprocessingShape" mc:Ignorable="w14 w15 w16se w16cid w16 w16cex w16sdtdh w16sdtfl w16du wp14">
   <w:footnote w:type="separator" w:id="-1">
@@ -17002,26 +17019,6 @@
     </w:p>
   </w:footnote>
 </w:footnotes>
-</file>
-
-<file path=word/header1.xml><?xml version="1.0" encoding="utf-8"?>
-<w:hdr xmlns:wpc="http://schemas.microsoft.com/office/word/2010/wordprocessingCanvas" xmlns:cx="http://schemas.microsoft.com/office/drawing/2014/chartex" xmlns:cx1="http://schemas.microsoft.com/office/drawing/2015/9/8/chartex" xmlns:cx2="http://schemas.microsoft.com/office/drawing/2015/10/21/chartex" xmlns:cx3="http://schemas.microsoft.com/office/drawing/2016/5/9/chartex" xmlns:cx4="http://schemas.microsoft.com/office/drawing/2016/5/10/chartex" xmlns:cx5="http://schemas.microsoft.com/office/drawing/2016/5/11/chartex" xmlns:cx6="http://schemas.microsoft.com/office/drawing/2016/5/12/chartex" xmlns:cx7="http://schemas.microsoft.com/office/drawing/2016/5/13/chartex" xmlns:cx8="http://schemas.microsoft.com/office/drawing/2016/5/14/chartex" xmlns:mc="http://schemas.openxmlformats.org/markup-compatibility/2006" xmlns:aink="http://schemas.microsoft.com/office/drawing/2016/ink" xmlns:am3d="http://schemas.microsoft.com/office/drawing/2017/model3d" xmlns:o="urn:schemas-microsoft-com:office:office" xmlns:oel="http://schemas.microsoft.com/office/2019/extlst" xmlns:r="http://schemas.openxmlformats.org/officeDocument/2006/relationships" xmlns:m="http://schemas.openxmlformats.org/officeDocument/2006/math" xmlns:v="urn:schemas-microsoft-com:vml" xmlns:wp14="http://schemas.microsoft.com/office/word/2010/wordprocessingDrawing" xmlns:wp="http://schemas.openxmlformats.org/drawingml/2006/wordprocessingDrawing" xmlns:w10="urn:schemas-microsoft-com:office:word" xmlns:w="http://schemas.openxmlformats.org/wordprocessingml/2006/main" xmlns:w14="http://schemas.microsoft.com/office/word/2010/wordml" xmlns:w15="http://schemas.microsoft.com/office/word/2012/wordml" xmlns:w16cex="http://schemas.microsoft.com/office/word/2018/wordml/cex" xmlns:w16cid="http://schemas.microsoft.com/office/word/2016/wordml/cid" xmlns:w16="http://schemas.microsoft.com/office/word/2018/wordml" xmlns:w16du="http://schemas.microsoft.com/office/word/2023/wordml/word16du" xmlns:w16sdtdh="http://schemas.microsoft.com/office/word/2020/wordml/sdtdatahash" xmlns:w16sdtfl="http://schemas.microsoft.com/office/word/2024/wordml/sdtformatlock" xmlns:w16se="http://schemas.microsoft.com/office/word/2015/wordml/symex" xmlns:wpg="http://schemas.microsoft.com/office/word/2010/wordprocessingGroup" xmlns:wpi="http://schemas.microsoft.com/office/word/2010/wordprocessingInk" xmlns:wne="http://schemas.microsoft.com/office/word/2006/wordml" xmlns:wps="http://schemas.microsoft.com/office/word/2010/wordprocessingShape" mc:Ignorable="w14 w15 w16se w16cid w16 w16cex w16sdtdh w16sdtfl w16du wp14">
-  <w:p>
-    <w:pPr>
-      <w:pStyle w:val="Header"/>
-    </w:pPr>
-  </w:p>
-</w:hdr>
-</file>
-
-<file path=word/header2.xml><?xml version="1.0" encoding="utf-8"?>
-<w:hdr xmlns:wpc="http://schemas.microsoft.com/office/word/2010/wordprocessingCanvas" xmlns:cx="http://schemas.microsoft.com/office/drawing/2014/chartex" xmlns:cx1="http://schemas.microsoft.com/office/drawing/2015/9/8/chartex" xmlns:cx2="http://schemas.microsoft.com/office/drawing/2015/10/21/chartex" xmlns:cx3="http://schemas.microsoft.com/office/drawing/2016/5/9/chartex" xmlns:cx4="http://schemas.microsoft.com/office/drawing/2016/5/10/chartex" xmlns:cx5="http://schemas.microsoft.com/office/drawing/2016/5/11/chartex" xmlns:cx6="http://schemas.microsoft.com/office/drawing/2016/5/12/chartex" xmlns:cx7="http://schemas.microsoft.com/office/drawing/2016/5/13/chartex" xmlns:cx8="http://schemas.microsoft.com/office/drawing/2016/5/14/chartex" xmlns:mc="http://schemas.openxmlformats.org/markup-compatibility/2006" xmlns:aink="http://schemas.microsoft.com/office/drawing/2016/ink" xmlns:am3d="http://schemas.microsoft.com/office/drawing/2017/model3d" xmlns:o="urn:schemas-microsoft-com:office:office" xmlns:oel="http://schemas.microsoft.com/office/2019/extlst" xmlns:r="http://schemas.openxmlformats.org/officeDocument/2006/relationships" xmlns:m="http://schemas.openxmlformats.org/officeDocument/2006/math" xmlns:v="urn:schemas-microsoft-com:vml" xmlns:wp14="http://schemas.microsoft.com/office/word/2010/wordprocessingDrawing" xmlns:wp="http://schemas.openxmlformats.org/drawingml/2006/wordprocessingDrawing" xmlns:w10="urn:schemas-microsoft-com:office:word" xmlns:w="http://schemas.openxmlformats.org/wordprocessingml/2006/main" xmlns:w14="http://schemas.microsoft.com/office/word/2010/wordml" xmlns:w15="http://schemas.microsoft.com/office/word/2012/wordml" xmlns:w16cex="http://schemas.microsoft.com/office/word/2018/wordml/cex" xmlns:w16cid="http://schemas.microsoft.com/office/word/2016/wordml/cid" xmlns:w16="http://schemas.microsoft.com/office/word/2018/wordml" xmlns:w16du="http://schemas.microsoft.com/office/word/2023/wordml/word16du" xmlns:w16sdtdh="http://schemas.microsoft.com/office/word/2020/wordml/sdtdatahash" xmlns:w16sdtfl="http://schemas.microsoft.com/office/word/2024/wordml/sdtformatlock" xmlns:w16se="http://schemas.microsoft.com/office/word/2015/wordml/symex" xmlns:wpg="http://schemas.microsoft.com/office/word/2010/wordprocessingGroup" xmlns:wpi="http://schemas.microsoft.com/office/word/2010/wordprocessingInk" xmlns:wne="http://schemas.microsoft.com/office/word/2006/wordml" xmlns:wps="http://schemas.microsoft.com/office/word/2010/wordprocessingShape" mc:Ignorable="w14 w15 w16se w16cid w16 w16cex w16sdtdh w16sdtfl w16du wp14">
-  <w:p>
-    <w:pPr>
-      <w:pStyle w:val="Header"/>
-    </w:pPr>
-  </w:p>
-</w:hdr>
 </file>
 
 <file path=word/numbering.xml><?xml version="1.0" encoding="utf-8"?>

</xml_diff>